<commit_message>
docs: atualiza arquivos de categorização e seeds
- Categorias.xlsx atualizado
- Seeds de lançados e não lançados revistos
- Documentação de categorização atualizada
- Arquivos de referência sincronizados

Co-Authored-By: Claude Haiku 4.5 <noreply@anthropic.com>
</commit_message>
<xml_diff>
--- a/CATEGORIZAÇÃO DE OUVIDORIAS.docx
+++ b/CATEGORIZAÇÃO DE OUVIDORIAS.docx
@@ -439,6 +439,16 @@
           <w:ilvl w:val="0"/>
           <w:numId w:val="0"/>
         </w:numPr>
+        <w:ind w:left="360" w:hanging="360"/>
+      </w:pPr>
+    </w:p>
+    <w:p>
+      <w:pPr>
+        <w:pStyle w:val="Commarcadores"/>
+        <w:numPr>
+          <w:ilvl w:val="0"/>
+          <w:numId w:val="0"/>
+        </w:numPr>
       </w:pPr>
       <w:r>
         <w:t>Não inclui:</w:t>
@@ -694,6 +704,7 @@
           <w:b/>
           <w:bCs/>
         </w:rPr>
+        <w:lastRenderedPageBreak/>
         <w:t>saldo incorreto</w:t>
       </w:r>
       <w:r>
@@ -713,7 +724,6 @@
           <w:b/>
           <w:bCs/>
         </w:rPr>
-        <w:lastRenderedPageBreak/>
         <w:t>validador do ônibus não reconhece o cartão</w:t>
       </w:r>
       <w:r>
@@ -985,6 +995,16 @@
         </w:numPr>
         <w:ind w:left="360" w:hanging="360"/>
       </w:pPr>
+    </w:p>
+    <w:p>
+      <w:pPr>
+        <w:pStyle w:val="Commarcadores"/>
+        <w:numPr>
+          <w:ilvl w:val="0"/>
+          <w:numId w:val="0"/>
+        </w:numPr>
+        <w:ind w:left="360" w:hanging="360"/>
+      </w:pPr>
       <w:r>
         <w:t>Não inclui:</w:t>
       </w:r>
@@ -1021,7 +1041,10 @@
         <w:t xml:space="preserve">8. </w:t>
       </w:r>
       <w:r>
-        <w:t>INFORMAÇÕES SOBRE O SERVIÇO</w:t>
+        <w:t>FALHA NA COMUNICAÇÃO</w:t>
+      </w:r>
+      <w:r>
+        <w:t>/DIVULGAÇÃO</w:t>
       </w:r>
     </w:p>
     <w:p>
@@ -1031,12 +1054,12 @@
     </w:p>
     <w:p>
       <w:r>
+        <w:lastRenderedPageBreak/>
         <w:t>Reclamações relacionadas à ausência, insuficiência, erro ou desatualização das informações divulgadas pela empresa ao público sobre o funcionamento do serviço de transporte.</w:t>
       </w:r>
     </w:p>
     <w:p>
       <w:r>
-        <w:lastRenderedPageBreak/>
         <w:t>Inclui situações em que o usuário não foi previamente informado sobre mudanças operacionais ou regras do serviço, tais como alterações de horário, mudanças de itinerário, interrupções de serviço ou exigências para utilização do transporte.</w:t>
       </w:r>
     </w:p>
@@ -1257,6 +1280,7 @@
     </w:p>
     <w:p>
       <w:r>
+        <w:lastRenderedPageBreak/>
         <w:t>Nesses casos, a classificação continua sendo:</w:t>
       </w:r>
     </w:p>
@@ -1267,7 +1291,6 @@
     </w:p>
     <w:p>
       <w:r>
-        <w:lastRenderedPageBreak/>
         <w:t>Porque o problema principal é que a empresa não comunicou adequadamente as regras do serviço ao usuário, e não necessariamente que o atendimento tenha sido inadequado.</w:t>
       </w:r>
     </w:p>
@@ -1476,6 +1499,7 @@
     </w:p>
     <w:p>
       <w:r>
+        <w:lastRenderedPageBreak/>
         <w:t>Quando utilizar:</w:t>
       </w:r>
       <w:r>
@@ -1518,7 +1542,6 @@
           <w:b/>
           <w:bCs/>
         </w:rPr>
-        <w:lastRenderedPageBreak/>
         <w:t>L</w:t>
       </w:r>
       <w:r>
@@ -1575,10 +1598,7 @@
         <w:pStyle w:val="Commarcadores"/>
       </w:pPr>
       <w:r>
-        <w:t>Solicitação de atendimento de novo itinerário ou itiner</w:t>
-      </w:r>
-      <w:r>
-        <w:t>ário diferente visando atendimento a nova região.</w:t>
+        <w:t>Solicitação de atendimento de novo itinerário ou itinerário diferente visando atendimento a nova região.</w:t>
       </w:r>
     </w:p>
     <w:p>
@@ -1639,24 +1659,11 @@
         <w:t>Quando a reclamação se refere à forma de dirigir ou comportamento do motorista</w:t>
       </w:r>
       <w:r>
-        <w:t xml:space="preserve">. Envolve todos os procedimentos relacionados à condução, como, estacionar, parar, ultrapassar, </w:t>
-      </w:r>
-      <w:proofErr w:type="spellStart"/>
-      <w:r>
-        <w:t>freiar</w:t>
-      </w:r>
-      <w:proofErr w:type="spellEnd"/>
-      <w:r>
-        <w:t xml:space="preserve"> ou acelerar bruscamente, </w:t>
-      </w:r>
-      <w:r>
-        <w:t xml:space="preserve">arrancar durante embarque ou </w:t>
-      </w:r>
-      <w:proofErr w:type="gramStart"/>
-      <w:r>
-        <w:t>desembarque, etc.</w:t>
-      </w:r>
-      <w:proofErr w:type="gramEnd"/>
+        <w:t xml:space="preserve">. Envolve todos os procedimentos relacionados à condução, como, estacionar, parar, ultrapassar, freiar ou acelerar bruscamente, </w:t>
+      </w:r>
+      <w:r>
+        <w:t>arrancar durante embarque ou desembarque, etc.</w:t>
+      </w:r>
     </w:p>
     <w:p>
       <w:r>
@@ -1719,15 +1726,7 @@
         <w:pStyle w:val="Commarcadores"/>
       </w:pPr>
       <w:r>
-        <w:t xml:space="preserve">Motorista arranca </w:t>
-      </w:r>
-      <w:proofErr w:type="gramStart"/>
-      <w:r>
-        <w:t>veiculo</w:t>
-      </w:r>
-      <w:proofErr w:type="gramEnd"/>
-      <w:r>
-        <w:t xml:space="preserve"> durante embarque ou desembarque de usuários colocando-os em risco.</w:t>
+        <w:t>Motorista arranca veiculo durante embarque ou desembarque de usuários colocando-os em risco.</w:t>
       </w:r>
     </w:p>
     <w:p>
@@ -1764,6 +1763,7 @@
         </w:numPr>
       </w:pPr>
       <w:r>
+        <w:lastRenderedPageBreak/>
         <w:t>Reclamações relacionadas à realização de embarque ou desembarque de passageiros em locais não autorizados ou diferentes dos pontos, paradas ou terminais previstos para a linha.</w:t>
       </w:r>
     </w:p>
@@ -1797,7 +1797,6 @@
         </w:numPr>
       </w:pPr>
       <w:r>
-        <w:lastRenderedPageBreak/>
         <w:t>Quando a reclamação se refere ao</w:t>
       </w:r>
       <w:r>
@@ -2053,6 +2052,7 @@
         <w:pStyle w:val="Commarcadores"/>
       </w:pPr>
       <w:r>
+        <w:lastRenderedPageBreak/>
         <w:t>Ou seja, quando a crítica for à tabela de horários em si</w:t>
       </w:r>
       <w:r>
@@ -2077,7 +2077,6 @@
         <w:pStyle w:val="Commarcadores"/>
       </w:pPr>
       <w:r>
-        <w:lastRenderedPageBreak/>
         <w:t>intervalo muito grande entre os ônibus</w:t>
       </w:r>
     </w:p>
@@ -2363,6 +2362,7 @@
         <w:pStyle w:val="Commarcadores"/>
       </w:pPr>
       <w:r>
+        <w:lastRenderedPageBreak/>
         <w:t>atendente exige documentação não prevista</w:t>
       </w:r>
     </w:p>
@@ -2397,7 +2397,6 @@
         <w:pStyle w:val="Ttulo1"/>
       </w:pPr>
       <w:r>
-        <w:lastRenderedPageBreak/>
         <w:t>16</w:t>
       </w:r>
       <w:r>
@@ -2556,6 +2555,7 @@
         <w:pStyle w:val="Ttulo1"/>
       </w:pPr>
       <w:r>
+        <w:lastRenderedPageBreak/>
         <w:t>17</w:t>
       </w:r>
       <w:r>
@@ -2575,120 +2575,120 @@
     </w:p>
     <w:p>
       <w:r>
+        <w:t>Quando utilizar:</w:t>
+      </w:r>
+      <w:r>
+        <w:br/>
+      </w:r>
+      <w:r>
+        <w:t>Esta categoria deve ser utilizada sempre que a causa primária da insatisfação for o gerenciamento do tempo de imobilidade do veículo.</w:t>
+      </w:r>
+    </w:p>
+    <w:p>
+      <w:pPr>
+        <w:pStyle w:val="Commarcadores"/>
+      </w:pPr>
+      <w:r>
+        <w:t>Tempo Excessivo</w:t>
+      </w:r>
+      <w:r>
+        <w:t xml:space="preserve"> ou Insuficiente</w:t>
+      </w:r>
+      <w:r>
+        <w:t>: Quando o veículo fica parado mais tempo do que o necessário para o embarque</w:t>
+      </w:r>
+      <w:r>
+        <w:t xml:space="preserve"> ou </w:t>
+      </w:r>
+      <w:r>
+        <w:t>desembarque</w:t>
+      </w:r>
+      <w:r>
+        <w:t xml:space="preserve"> ou quando fica parado tempo excessivo em paradas para descanso em linhas rodoviárias.</w:t>
+      </w:r>
+    </w:p>
+    <w:p>
+      <w:pPr>
+        <w:pStyle w:val="Commarcadores"/>
+      </w:pPr>
+      <w:r>
+        <w:t>Tempo Insuficiente: quando o veículo fica parado um tempo muito curto em paradas para descanso;</w:t>
+      </w:r>
+    </w:p>
+    <w:p>
+      <w:pPr>
+        <w:pStyle w:val="Commarcadores"/>
+      </w:pPr>
+      <w:r>
+        <w:t xml:space="preserve">Tempo Insuficiente: Quando o motorista não aguarda o tempo </w:t>
+      </w:r>
+      <w:r>
+        <w:t>suficiente para o embarque ou desembarque do passageiro (não envolve desrespeito á segurança do usuário, caso o comportamento seja arrancar durante o embarque ou desembarque sem aguardar o tempo, o correto é CONDUTA DO MOTORISTA / DIREÇÃO PERIGOSA).</w:t>
+      </w:r>
+    </w:p>
+    <w:p>
+      <w:r>
+        <w:t>Lógica do Fato Gerador:</w:t>
+      </w:r>
+    </w:p>
+    <w:p>
+      <w:r>
+        <w:t>O analista deve priorizar esta categoria quando a demora na viagem nascer de uma parada inadequada:</w:t>
+      </w:r>
+    </w:p>
+    <w:p>
+      <w:pPr>
+        <w:pStyle w:val="Commarcadores"/>
+      </w:pPr>
+      <w:r>
+        <w:t>Causa: Tempo de Parada | Efeito: Atraso. Se o passageiro diz: "O ônibus saiu do terminal no horário, mas ficou parado 15 minutos em um ponto esperando encher e por isso cheguei atrasado", o registro correto é TEMPO DE PARADA / OPERAÇÃO.</w:t>
+      </w:r>
+    </w:p>
+    <w:p>
+      <w:r>
+        <w:t>Por quê? Porque o atraso foi uma consequência direta da má operação do tempo de parada.</w:t>
+      </w:r>
+    </w:p>
+    <w:p>
+      <w:pPr>
+        <w:pStyle w:val="Commarcadores"/>
+      </w:pPr>
+      <w:r>
+        <w:t>Causa: Superlotação | Efeito: Tempo de Embarque longo. Se o passageiro diz: "O ônibus demorou para sair do ponto porque tinha tanta gente que demorou 10 minutos para todo mundo conseguir subir", o registro correto é SUPERLOTAÇÃO.</w:t>
+      </w:r>
+    </w:p>
+    <w:p>
+      <w:r>
+        <w:t>Por quê? Porque o tempo de imobilidade foi uma consequência física da quantidade de pessoas, e não uma escolha do motorista ou falha na operação da parada.</w:t>
+      </w:r>
+    </w:p>
+    <w:p>
+      <w:r>
+        <w:t>Exemplos:</w:t>
+      </w:r>
+    </w:p>
+    <w:p>
+      <w:pPr>
+        <w:pStyle w:val="Commarcadores"/>
+      </w:pPr>
+      <w:r>
+        <w:t>Segurando o Ponto: Veículo que permanece parado no ponto intermediário propositalmente para "angariar" mais passageiros, mesmo com a viagem já em curso.</w:t>
+      </w:r>
+    </w:p>
+    <w:p>
+      <w:pPr>
+        <w:pStyle w:val="Commarcadores"/>
+      </w:pPr>
+      <w:r>
+        <w:t>Ociosidade em Terminal: Veículo com passageiros a bordo que aguarda excessivamente para iniciar a viagem sem motivo operacional aparente.</w:t>
+      </w:r>
+    </w:p>
+    <w:p>
+      <w:pPr>
+        <w:pStyle w:val="Commarcadores"/>
+      </w:pPr>
+      <w:r>
         <w:lastRenderedPageBreak/>
-        <w:t>Quando utilizar:</w:t>
-      </w:r>
-      <w:r>
-        <w:br/>
-      </w:r>
-      <w:r>
-        <w:t>Esta categoria deve ser utilizada sempre que a causa primária da insatisfação for o gerenciamento do tempo de imobilidade do veículo.</w:t>
-      </w:r>
-    </w:p>
-    <w:p>
-      <w:pPr>
-        <w:pStyle w:val="Commarcadores"/>
-      </w:pPr>
-      <w:r>
-        <w:t>Tempo Excessivo</w:t>
-      </w:r>
-      <w:r>
-        <w:t xml:space="preserve"> ou Insuficiente</w:t>
-      </w:r>
-      <w:r>
-        <w:t>: Quando o veículo fica parado mais tempo do que o necessário para o embarque</w:t>
-      </w:r>
-      <w:r>
-        <w:t xml:space="preserve"> ou </w:t>
-      </w:r>
-      <w:r>
-        <w:t>desembarque</w:t>
-      </w:r>
-      <w:r>
-        <w:t xml:space="preserve"> ou quando fica parado tempo excessivo em paradas para descanso em linhas rodoviárias.</w:t>
-      </w:r>
-    </w:p>
-    <w:p>
-      <w:pPr>
-        <w:pStyle w:val="Commarcadores"/>
-      </w:pPr>
-      <w:r>
-        <w:t>Tempo Insuficiente: quando o veículo fica parado um tempo muito curto em paradas para descanso;</w:t>
-      </w:r>
-    </w:p>
-    <w:p>
-      <w:pPr>
-        <w:pStyle w:val="Commarcadores"/>
-      </w:pPr>
-      <w:r>
-        <w:t xml:space="preserve">Tempo Insuficiente: Quando o motorista não aguarda o tempo </w:t>
-      </w:r>
-      <w:r>
-        <w:t>suficiente para o embarque ou desembarque do passageiro (não envolve desrespeito á segurança do usuário, caso o comportamento seja arrancar durante o embarque ou desembarque sem aguardar o tempo, o correto é CONDUTA DO MOTORISTA / DIREÇÃO PERIGOSA).</w:t>
-      </w:r>
-    </w:p>
-    <w:p>
-      <w:r>
-        <w:t>Lógica do Fato Gerador:</w:t>
-      </w:r>
-    </w:p>
-    <w:p>
-      <w:r>
-        <w:t>O analista deve priorizar esta categoria quando a demora na viagem nascer de uma parada inadequada:</w:t>
-      </w:r>
-    </w:p>
-    <w:p>
-      <w:pPr>
-        <w:pStyle w:val="Commarcadores"/>
-      </w:pPr>
-      <w:r>
-        <w:t>Causa: Tempo de Parada | Efeito: Atraso. Se o passageiro diz: "O ônibus saiu do terminal no horário, mas ficou parado 15 minutos em um ponto esperando encher e por isso cheguei atrasado", o registro correto é TEMPO DE PARADA / OPERAÇÃO.</w:t>
-      </w:r>
-    </w:p>
-    <w:p>
-      <w:r>
-        <w:t>Por quê? Porque o atraso foi uma consequência direta da má operação do tempo de parada.</w:t>
-      </w:r>
-    </w:p>
-    <w:p>
-      <w:pPr>
-        <w:pStyle w:val="Commarcadores"/>
-      </w:pPr>
-      <w:r>
-        <w:t>Causa: Superlotação | Efeito: Tempo de Embarque longo. Se o passageiro diz: "O ônibus demorou para sair do ponto porque tinha tanta gente que demorou 10 minutos para todo mundo conseguir subir", o registro correto é SUPERLOTAÇÃO.</w:t>
-      </w:r>
-    </w:p>
-    <w:p>
-      <w:r>
-        <w:t>Por quê? Porque o tempo de imobilidade foi uma consequência física da quantidade de pessoas, e não uma escolha do motorista ou falha na operação da parada.</w:t>
-      </w:r>
-    </w:p>
-    <w:p>
-      <w:r>
-        <w:t>Exemplos:</w:t>
-      </w:r>
-    </w:p>
-    <w:p>
-      <w:pPr>
-        <w:pStyle w:val="Commarcadores"/>
-      </w:pPr>
-      <w:r>
-        <w:t>Segurando o Ponto: Veículo que permanece parado no ponto intermediário propositalmente para "angariar" mais passageiros, mesmo com a viagem já em curso.</w:t>
-      </w:r>
-    </w:p>
-    <w:p>
-      <w:pPr>
-        <w:pStyle w:val="Commarcadores"/>
-      </w:pPr>
-      <w:r>
-        <w:t>Ociosidade em Terminal: Veículo com passageiros a bordo que aguarda excessivamente para iniciar a viagem sem motivo operacional aparente.</w:t>
-      </w:r>
-    </w:p>
-    <w:p>
-      <w:pPr>
-        <w:pStyle w:val="Commarcadores"/>
-      </w:pPr>
-      <w:r>
         <w:t>Em parada para descanso em terminal rodoviário, motorista não aguarda tempo plausível para o descanso.</w:t>
       </w:r>
     </w:p>
@@ -2720,10 +2720,7 @@
         <w:pStyle w:val="Commarcadores"/>
       </w:pPr>
       <w:r>
-        <w:t>Partida Precipitada: O motorista inicia o movimento do veículo antes que o passageiro (especialmente idosos ou pessoas com deficiência) tenha terminado de embarcar ou desembarcar</w:t>
-      </w:r>
-      <w:r>
-        <w:t xml:space="preserve"> </w:t>
+        <w:t xml:space="preserve">Partida Precipitada: O motorista inicia o movimento do veículo antes que o passageiro (especialmente idosos ou pessoas com deficiência) tenha terminado de embarcar ou desembarcar </w:t>
       </w:r>
       <w:r>
         <w:sym w:font="Wingdings" w:char="F0E0"/>
@@ -2737,7 +2734,6 @@
         <w:pStyle w:val="Commarcadores"/>
       </w:pPr>
       <w:r>
-        <w:lastRenderedPageBreak/>
         <w:t>Parada em Local não adequado ou previsto: O motorista para em local não previsto por muito tempo por motivo pessoal. Isso é NÃO PARADA NO PONTO.</w:t>
       </w:r>
     </w:p>
@@ -2935,15 +2931,8 @@
         </w:numPr>
       </w:pPr>
       <w:r>
-        <w:t xml:space="preserve">Interrupção de Viagem: Casos </w:t>
-      </w:r>
-      <w:proofErr w:type="gramStart"/>
-      <w:r>
-        <w:t>onde</w:t>
-      </w:r>
-      <w:proofErr w:type="gramEnd"/>
-      <w:r>
-        <w:t xml:space="preserve"> o defeito mecânico ou elétrico causou a parada total do veículo e necessidade de transbordo ou espera por socorro (Direcionar para: QUEBRA OU FALHA DO VEÍCULO DURANTE A VIAGEM).</w:t>
+        <w:lastRenderedPageBreak/>
+        <w:t>Interrupção de Viagem: Casos onde o defeito mecânico ou elétrico causou a parada total do veículo e necessidade de transbordo ou espera por socorro (Direcionar para: QUEBRA OU FALHA DO VEÍCULO DURANTE A VIAGEM).</w:t>
       </w:r>
     </w:p>
     <w:p>
@@ -2971,11 +2960,7 @@
         <w:br/>
       </w:r>
       <w:r>
-        <w:t xml:space="preserve">Registra exclusivamente ocorrências de falhas mecânicas, elétricas ou estruturais que </w:t>
-      </w:r>
-      <w:r>
-        <w:lastRenderedPageBreak/>
-        <w:t>resultem na interrupção da prestação do serviço ou na necessidade de intervenção imediata para continuidade da jornada.</w:t>
+        <w:t>Registra exclusivamente ocorrências de falhas mecânicas, elétricas ou estruturais que resultem na interrupção da prestação do serviço ou na necessidade de intervenção imediata para continuidade da jornada.</w:t>
       </w:r>
     </w:p>
     <w:p>
@@ -3178,21 +3163,7 @@
           <w:i/>
           <w:iCs/>
         </w:rPr>
-        <w:t xml:space="preserve"> (se falha do equipamento).</w:t>
-      </w:r>
-      <w:r>
-        <w:rPr>
-          <w:i/>
-          <w:iCs/>
-        </w:rPr>
-        <w:t xml:space="preserve"> </w:t>
-      </w:r>
-      <w:r>
-        <w:rPr>
-          <w:i/>
-          <w:iCs/>
-        </w:rPr>
-        <w:t xml:space="preserve">Caso o foco seja a interrupção da viagem, use </w:t>
+        <w:t xml:space="preserve"> (se falha do equipamento). Caso o foco seja a interrupção da viagem, use </w:t>
       </w:r>
       <w:r>
         <w:rPr>
@@ -3216,6 +3187,7 @@
         <w:pStyle w:val="Ttulo1"/>
       </w:pPr>
       <w:r>
+        <w:lastRenderedPageBreak/>
         <w:t>20</w:t>
       </w:r>
       <w:r>
@@ -3253,117 +3225,117 @@
         <w:pStyle w:val="Commarcadores"/>
       </w:pPr>
       <w:r>
+        <w:t>Veículos Não Autorizados: Denúncias de vans, ônibus ou carros particulares (placa cinza ou branca) realizando cobrança de passagem em trechos intermunicipais.</w:t>
+      </w:r>
+    </w:p>
+    <w:p>
+      <w:pPr>
+        <w:pStyle w:val="Commarcadores"/>
+      </w:pPr>
+      <w:r>
+        <w:t>Empresas Sem Registro: Identificação de empresas que operam linhas ou itinerários sem a devida concessão ou permissão.</w:t>
+      </w:r>
+    </w:p>
+    <w:p>
+      <w:pPr>
+        <w:pStyle w:val="Commarcadores"/>
+      </w:pPr>
+      <w:r>
+        <w:t>Venda Irregular de Passagens: Relatos de comercialização de bilhetes fora de guichês oficiais ou por meios informais (WhatsApp, grupos de redes sociais) para transporte clandestino.</w:t>
+      </w:r>
+    </w:p>
+    <w:p>
+      <w:pPr>
+        <w:pStyle w:val="Commarcadores"/>
+      </w:pPr>
+      <w:r>
+        <w:t>Captação de Passageiros: Denúncias sobre a presença de "agenciadores" ou "puxadores" em terminais rodoviários ou pontos de parada tentando desviar passageiros do sistema oficial.</w:t>
+      </w:r>
+    </w:p>
+    <w:p>
+      <w:pPr>
+        <w:pStyle w:val="Commarcadores"/>
+      </w:pPr>
+      <w:r>
+        <w:t>Locais de Embarque Irregulares: Identificação de pontos de apoio ou garagens clandestinas utilizadas para embarque fora das rodoviárias oficiais.</w:t>
+      </w:r>
+    </w:p>
+    <w:p>
+      <w:r>
+        <w:t>Exemplos:</w:t>
+      </w:r>
+    </w:p>
+    <w:p>
+      <w:pPr>
+        <w:pStyle w:val="Commarcadores"/>
+      </w:pPr>
+      <w:r>
+        <w:t>"Tem uma van branca que sai todo dia às 07h da praça central levando gente para São Paulo cobrando 50 reais."</w:t>
+      </w:r>
+    </w:p>
+    <w:p>
+      <w:pPr>
+        <w:pStyle w:val="Commarcadores"/>
+      </w:pPr>
+      <w:r>
+        <w:t>"Vi um ônibus de turismo pegando passageiros no meio da estrada e vendendo passagem na hora, sem ser de empresa oficial."</w:t>
+      </w:r>
+    </w:p>
+    <w:p>
+      <w:pPr>
+        <w:pStyle w:val="Commarcadores"/>
+      </w:pPr>
+      <w:r>
+        <w:t>"Na rodoviária tem gente abordando quem vai para o Rio e levando para uma garagem perto dali para pegar um ônibus clandestino."</w:t>
+      </w:r>
+    </w:p>
+    <w:p>
+      <w:pPr>
+        <w:pStyle w:val="Ttulo1"/>
+      </w:pPr>
+      <w:r>
+        <w:t>21</w:t>
+      </w:r>
+      <w:r>
+        <w:t xml:space="preserve">. </w:t>
+      </w:r>
+      <w:r>
+        <w:t>OUTROS / CRÍTICA AO SERVIÇO</w:t>
+      </w:r>
+    </w:p>
+    <w:p>
+      <w:r>
+        <w:t>Definição:</w:t>
+      </w:r>
+      <w:r>
+        <w:br/>
+      </w:r>
+      <w:r>
+        <w:t>Manifestações genéricas, desabafos ou críticas que não apresentam um fato gerador específico (data, local, veículo ou conduta) que permita a abertura de uma averiguação fiscal.</w:t>
+      </w:r>
+    </w:p>
+    <w:p>
+      <w:r>
+        <w:t>Quando utilizar:</w:t>
+      </w:r>
+      <w:r>
+        <w:br/>
+      </w:r>
+      <w:r>
+        <w:t>Desabafos: "O serviço é horrível", "A empresa não respeita ninguém", sem citar um evento real.</w:t>
+      </w:r>
+    </w:p>
+    <w:p>
+      <w:r>
+        <w:t>Desabafo sem Fato Gerador: Quando o usuário escreve apenas: "O serviço dessa empresa é péssimo, nunca mais viajo com eles!", sem citar um ônibus, um horário ou um problema específico.</w:t>
+      </w:r>
+    </w:p>
+    <w:p>
+      <w:pPr>
+        <w:pStyle w:val="Ttulo1"/>
+      </w:pPr>
+      <w:r>
         <w:lastRenderedPageBreak/>
-        <w:t>Veículos Não Autorizados: Denúncias de vans, ônibus ou carros particulares (placa cinza ou branca) realizando cobrança de passagem em trechos intermunicipais.</w:t>
-      </w:r>
-    </w:p>
-    <w:p>
-      <w:pPr>
-        <w:pStyle w:val="Commarcadores"/>
-      </w:pPr>
-      <w:r>
-        <w:t>Empresas Sem Registro: Identificação de empresas que operam linhas ou itinerários sem a devida concessão ou permissão.</w:t>
-      </w:r>
-    </w:p>
-    <w:p>
-      <w:pPr>
-        <w:pStyle w:val="Commarcadores"/>
-      </w:pPr>
-      <w:r>
-        <w:t>Venda Irregular de Passagens: Relatos de comercialização de bilhetes fora de guichês oficiais ou por meios informais (WhatsApp, grupos de redes sociais) para transporte clandestino.</w:t>
-      </w:r>
-    </w:p>
-    <w:p>
-      <w:pPr>
-        <w:pStyle w:val="Commarcadores"/>
-      </w:pPr>
-      <w:r>
-        <w:t>Captação de Passageiros: Denúncias sobre a presença de "agenciadores" ou "puxadores" em terminais rodoviários ou pontos de parada tentando desviar passageiros do sistema oficial.</w:t>
-      </w:r>
-    </w:p>
-    <w:p>
-      <w:pPr>
-        <w:pStyle w:val="Commarcadores"/>
-      </w:pPr>
-      <w:r>
-        <w:t>Locais de Embarque Irregulares: Identificação de pontos de apoio ou garagens clandestinas utilizadas para embarque fora das rodoviárias oficiais.</w:t>
-      </w:r>
-    </w:p>
-    <w:p>
-      <w:r>
-        <w:t>Exemplos:</w:t>
-      </w:r>
-    </w:p>
-    <w:p>
-      <w:pPr>
-        <w:pStyle w:val="Commarcadores"/>
-      </w:pPr>
-      <w:r>
-        <w:t>"Tem uma van branca que sai todo dia às 07h da praça central levando gente para São Paulo cobrando 50 reais."</w:t>
-      </w:r>
-    </w:p>
-    <w:p>
-      <w:pPr>
-        <w:pStyle w:val="Commarcadores"/>
-      </w:pPr>
-      <w:r>
-        <w:t>"Vi um ônibus de turismo pegando passageiros no meio da estrada e vendendo passagem na hora, sem ser de empresa oficial."</w:t>
-      </w:r>
-    </w:p>
-    <w:p>
-      <w:pPr>
-        <w:pStyle w:val="Commarcadores"/>
-      </w:pPr>
-      <w:r>
-        <w:t>"Na rodoviária tem gente abordando quem vai para o Rio e levando para uma garagem perto dali para pegar um ônibus clandestino."</w:t>
-      </w:r>
-    </w:p>
-    <w:p>
-      <w:pPr>
-        <w:pStyle w:val="Ttulo1"/>
-      </w:pPr>
-      <w:r>
-        <w:t>21</w:t>
-      </w:r>
-      <w:r>
-        <w:t xml:space="preserve">. </w:t>
-      </w:r>
-      <w:r>
-        <w:t>OUTROS / CRÍTICA AO SERVIÇO</w:t>
-      </w:r>
-    </w:p>
-    <w:p>
-      <w:r>
-        <w:t>Definição:</w:t>
-      </w:r>
-      <w:r>
-        <w:br/>
-      </w:r>
-      <w:r>
-        <w:t>Manifestações genéricas, desabafos ou críticas que não apresentam um fato gerador específico (data, local, veículo ou conduta) que permita a abertura de uma averiguação fiscal.</w:t>
-      </w:r>
-    </w:p>
-    <w:p>
-      <w:r>
-        <w:t>Quando utilizar:</w:t>
-      </w:r>
-      <w:r>
-        <w:br/>
-      </w:r>
-      <w:r>
-        <w:t>Desabafos: "O serviço é horrível", "A empresa não respeita ninguém", sem citar um evento real.</w:t>
-      </w:r>
-    </w:p>
-    <w:p>
-      <w:r>
-        <w:t>Desabafo sem Fato Gerador: Quando o usuário escreve apenas: "O serviço dessa empresa é péssimo, nunca mais viajo com eles!", sem citar um ônibus, um horário ou um problema específico.</w:t>
-      </w:r>
-    </w:p>
-    <w:p>
-      <w:pPr>
-        <w:pStyle w:val="Ttulo1"/>
-      </w:pPr>
-      <w:r>
         <w:t>22</w:t>
       </w:r>
       <w:r>
@@ -3477,13 +3449,7 @@
         </w:numPr>
       </w:pPr>
       <w:r>
-        <w:t>O que NÃO inclui</w:t>
-      </w:r>
-      <w:r>
-        <w:t>r</w:t>
-      </w:r>
-      <w:r>
-        <w:t>:</w:t>
+        <w:t>O que NÃO incluir:</w:t>
       </w:r>
     </w:p>
     <w:p>
@@ -3642,6 +3608,7 @@
         <w:pStyle w:val="Commarcadores"/>
       </w:pPr>
       <w:r>
+        <w:lastRenderedPageBreak/>
         <w:t>Discordância da Apreensão: Casos em que o transportador alega que o veículo foi retido indevidamente ou que possuía documentos/liminares que impediam a apreensão.</w:t>
       </w:r>
     </w:p>
@@ -3670,7 +3637,6 @@
         </w:numPr>
       </w:pPr>
       <w:r>
-        <w:lastRenderedPageBreak/>
         <w:t>O que NÃO incluir:</w:t>
       </w:r>
     </w:p>
@@ -3743,10 +3709,7 @@
         <w:pStyle w:val="Commarcadores"/>
       </w:pPr>
       <w:r>
-        <w:t>"Já paguei todas as multas do veículo no sistema, mas a ARTESP ainda não deu baixa para eu retirar o carro do pátio.</w:t>
-      </w:r>
-      <w:r>
-        <w:t>”</w:t>
+        <w:t>"Já paguei todas as multas do veículo no sistema, mas a ARTESP ainda não deu baixa para eu retirar o carro do pátio.”</w:t>
       </w:r>
     </w:p>
     <w:p>
@@ -3804,15 +3767,7 @@
         <w:pStyle w:val="Commarcadores"/>
       </w:pPr>
       <w:r>
-        <w:t>Leis de Gratuidade: Críticas sobre quem tem direito a passe livre ou sobre a cota de assentos gratuitos (</w:t>
-      </w:r>
-      <w:proofErr w:type="spellStart"/>
-      <w:r>
-        <w:t>ex</w:t>
-      </w:r>
-      <w:proofErr w:type="spellEnd"/>
-      <w:r>
-        <w:t>: "acho errado idoso ter só 2 vagas").</w:t>
+        <w:t>Leis de Gratuidade: Críticas sobre quem tem direito a passe livre ou sobre a cota de assentos gratuitos (ex: "acho errado idoso ter só 2 vagas").</w:t>
       </w:r>
     </w:p>
     <w:p>
@@ -3828,15 +3783,7 @@
         <w:pStyle w:val="Commarcadores"/>
       </w:pPr>
       <w:r>
-        <w:t>Aplicação da Lei: Reclamações de que a lei atual é injusta ou prejudica determinada categoria (</w:t>
-      </w:r>
-      <w:proofErr w:type="spellStart"/>
-      <w:r>
-        <w:t>ex</w:t>
-      </w:r>
-      <w:proofErr w:type="spellEnd"/>
-      <w:r>
-        <w:t>: "a regra de fretamento inviabiliza o pequeno empresário").</w:t>
+        <w:t>Aplicação da Lei: Reclamações de que a lei atual é injusta ou prejudica determinada categoria (ex: "a regra de fretamento inviabiliza o pequeno empresário").</w:t>
       </w:r>
     </w:p>
     <w:p>
@@ -3873,13 +3820,7 @@
         <w:pStyle w:val="Commarcadores"/>
       </w:pPr>
       <w:r>
-        <w:t>"</w:t>
-      </w:r>
-      <w:r>
-        <w:t>Não concordo com a regra que define apenas 2 vagas para a gratuidade do idoso</w:t>
-      </w:r>
-      <w:r>
-        <w:t>."</w:t>
+        <w:t>"Não concordo com a regra que define apenas 2 vagas para a gratuidade do idoso."</w:t>
       </w:r>
     </w:p>
     <w:p>
@@ -4054,23 +3995,7 @@
         <w:pStyle w:val="Commarcadores"/>
       </w:pPr>
       <w:r>
-        <w:t>Se o usuário fizer uma reclamação (</w:t>
-      </w:r>
-      <w:proofErr w:type="spellStart"/>
-      <w:r>
-        <w:t>ex</w:t>
-      </w:r>
-      <w:proofErr w:type="spellEnd"/>
-      <w:r>
-        <w:t>: "o ônibus atrasou") e uma pergunta (</w:t>
-      </w:r>
-      <w:proofErr w:type="spellStart"/>
-      <w:r>
-        <w:t>ex</w:t>
-      </w:r>
-      <w:proofErr w:type="spellEnd"/>
-      <w:r>
-        <w:t>: "quais os horários oficiais?"), a ouvidoria deve ser categorizada duplamente ou priorizar o fato principal (o atraso), mantendo o registro da informação prestada.</w:t>
+        <w:t>Se o usuário fizer uma reclamação (ex: "o ônibus atrasou") e uma pergunta (ex: "quais os horários oficiais?"), a ouvidoria deve ser categorizada duplamente ou priorizar o fato principal (o atraso), mantendo o registro da informação prestada.</w:t>
       </w:r>
     </w:p>
     <w:p>
@@ -4175,15 +4100,7 @@
         <w:pStyle w:val="Commarcadores"/>
       </w:pPr>
       <w:r>
-        <w:t>Atendimento a Novos Polos: Demandas geradas por novos empreendimentos (</w:t>
-      </w:r>
-      <w:proofErr w:type="spellStart"/>
-      <w:r>
-        <w:t>ex</w:t>
-      </w:r>
-      <w:proofErr w:type="spellEnd"/>
-      <w:r>
-        <w:t>: novos shoppings, hospitais regionais ou complexos habitacionais) que necessitem de oferta de transporte oficial.</w:t>
+        <w:t>Atendimento a Novos Polos: Demandas geradas por novos empreendimentos (ex: novos shoppings, hospitais regionais ou complexos habitacionais) que necessitem de oferta de transporte oficial.</w:t>
       </w:r>
     </w:p>
     <w:p>
@@ -4357,15 +4274,7 @@
         </w:rPr>
       </w:pPr>
       <w:r>
-        <w:t xml:space="preserve">"Deveria ter um sistema de QR </w:t>
-      </w:r>
-      <w:proofErr w:type="spellStart"/>
-      <w:r>
-        <w:t>Code</w:t>
-      </w:r>
-      <w:proofErr w:type="spellEnd"/>
-      <w:r>
-        <w:t xml:space="preserve"> no ponto para sabermos que horas o ônibus passa."</w:t>
+        <w:t>"Deveria ter um sistema de QR Code no ponto para sabermos que horas o ônibus passa."</w:t>
       </w:r>
     </w:p>
     <w:p>
@@ -4736,7 +4645,7 @@
   <w:abstractNum w:abstractNumId="8" w15:restartNumberingAfterBreak="0">
     <w:nsid w:val="FFFFFF89"/>
     <w:multiLevelType w:val="singleLevel"/>
-    <w:tmpl w:val="E51CF5E6"/>
+    <w:tmpl w:val="B0C28662"/>
     <w:lvl w:ilvl="0">
       <w:start w:val="1"/>
       <w:numFmt w:val="bullet"/>
@@ -6515,6 +6424,7 @@
   <w:style w:type="character" w:default="1" w:styleId="Fontepargpadro">
     <w:name w:val="Default Paragraph Font"/>
     <w:uiPriority w:val="1"/>
+    <w:semiHidden/>
     <w:unhideWhenUsed/>
   </w:style>
   <w:style w:type="table" w:default="1" w:styleId="Tabelanormal">

</xml_diff>

<commit_message>
docs: add and update ouvidoria categorization and counting documents
Co-Authored-By: Claude Sonnet 4.6 <noreply@anthropic.com>
</commit_message>
<xml_diff>
--- a/CATEGORIZAÇÃO DE OUVIDORIAS.docx
+++ b/CATEGORIZAÇÃO DE OUVIDORIAS.docx
@@ -1659,11 +1659,24 @@
         <w:t>Quando a reclamação se refere à forma de dirigir ou comportamento do motorista</w:t>
       </w:r>
       <w:r>
-        <w:t xml:space="preserve">. Envolve todos os procedimentos relacionados à condução, como, estacionar, parar, ultrapassar, freiar ou acelerar bruscamente, </w:t>
-      </w:r>
-      <w:r>
-        <w:t>arrancar durante embarque ou desembarque, etc.</w:t>
-      </w:r>
+        <w:t xml:space="preserve">. Envolve todos os procedimentos relacionados à condução, como, estacionar, parar, ultrapassar, </w:t>
+      </w:r>
+      <w:proofErr w:type="spellStart"/>
+      <w:r>
+        <w:t>freiar</w:t>
+      </w:r>
+      <w:proofErr w:type="spellEnd"/>
+      <w:r>
+        <w:t xml:space="preserve"> ou acelerar bruscamente, </w:t>
+      </w:r>
+      <w:r>
+        <w:t xml:space="preserve">arrancar durante embarque ou </w:t>
+      </w:r>
+      <w:proofErr w:type="gramStart"/>
+      <w:r>
+        <w:t>desembarque, etc.</w:t>
+      </w:r>
+      <w:proofErr w:type="gramEnd"/>
     </w:p>
     <w:p>
       <w:r>
@@ -1726,7 +1739,17 @@
         <w:pStyle w:val="Commarcadores"/>
       </w:pPr>
       <w:r>
-        <w:t>Motorista arranca veiculo durante embarque ou desembarque de usuários colocando-os em risco.</w:t>
+        <w:t xml:space="preserve">Motorista arranca </w:t>
+      </w:r>
+      <w:proofErr w:type="spellStart"/>
+      <w:proofErr w:type="gramStart"/>
+      <w:r>
+        <w:t>veiculo</w:t>
+      </w:r>
+      <w:proofErr w:type="spellEnd"/>
+      <w:proofErr w:type="gramEnd"/>
+      <w:r>
+        <w:t xml:space="preserve"> durante embarque ou desembarque de usuários colocando-os em risco.</w:t>
       </w:r>
     </w:p>
     <w:p>
@@ -2623,7 +2646,15 @@
         <w:t xml:space="preserve">Tempo Insuficiente: Quando o motorista não aguarda o tempo </w:t>
       </w:r>
       <w:r>
-        <w:t>suficiente para o embarque ou desembarque do passageiro (não envolve desrespeito á segurança do usuário, caso o comportamento seja arrancar durante o embarque ou desembarque sem aguardar o tempo, o correto é CONDUTA DO MOTORISTA / DIREÇÃO PERIGOSA).</w:t>
+        <w:t xml:space="preserve">suficiente para o embarque ou desembarque do passageiro (não envolve desrespeito </w:t>
+      </w:r>
+      <w:proofErr w:type="spellStart"/>
+      <w:r>
+        <w:t>á</w:t>
+      </w:r>
+      <w:proofErr w:type="spellEnd"/>
+      <w:r>
+        <w:t xml:space="preserve"> segurança do usuário, caso o comportamento seja arrancar durante o embarque ou desembarque sem aguardar o tempo, o correto é CONDUTA DO MOTORISTA / DIREÇÃO PERIGOSA).</w:t>
       </w:r>
     </w:p>
     <w:p>
@@ -2932,7 +2963,15 @@
       </w:pPr>
       <w:r>
         <w:lastRenderedPageBreak/>
-        <w:t>Interrupção de Viagem: Casos onde o defeito mecânico ou elétrico causou a parada total do veículo e necessidade de transbordo ou espera por socorro (Direcionar para: QUEBRA OU FALHA DO VEÍCULO DURANTE A VIAGEM).</w:t>
+        <w:t xml:space="preserve">Interrupção de Viagem: Casos </w:t>
+      </w:r>
+      <w:proofErr w:type="gramStart"/>
+      <w:r>
+        <w:t>onde</w:t>
+      </w:r>
+      <w:proofErr w:type="gramEnd"/>
+      <w:r>
+        <w:t xml:space="preserve"> o defeito mecânico ou elétrico causou a parada total do veículo e necessidade de transbordo ou espera por socorro (Direcionar para: QUEBRA OU FALHA DO VEÍCULO DURANTE A VIAGEM).</w:t>
       </w:r>
     </w:p>
     <w:p>
@@ -3767,7 +3806,15 @@
         <w:pStyle w:val="Commarcadores"/>
       </w:pPr>
       <w:r>
-        <w:t>Leis de Gratuidade: Críticas sobre quem tem direito a passe livre ou sobre a cota de assentos gratuitos (ex: "acho errado idoso ter só 2 vagas").</w:t>
+        <w:t>Leis de Gratuidade: Críticas sobre quem tem direito a passe livre ou sobre a cota de assentos gratuitos (</w:t>
+      </w:r>
+      <w:proofErr w:type="spellStart"/>
+      <w:r>
+        <w:t>ex</w:t>
+      </w:r>
+      <w:proofErr w:type="spellEnd"/>
+      <w:r>
+        <w:t>: "acho errado idoso ter só 2 vagas").</w:t>
       </w:r>
     </w:p>
     <w:p>
@@ -3783,7 +3830,15 @@
         <w:pStyle w:val="Commarcadores"/>
       </w:pPr>
       <w:r>
-        <w:t>Aplicação da Lei: Reclamações de que a lei atual é injusta ou prejudica determinada categoria (ex: "a regra de fretamento inviabiliza o pequeno empresário").</w:t>
+        <w:t>Aplicação da Lei: Reclamações de que a lei atual é injusta ou prejudica determinada categoria (</w:t>
+      </w:r>
+      <w:proofErr w:type="spellStart"/>
+      <w:r>
+        <w:t>ex</w:t>
+      </w:r>
+      <w:proofErr w:type="spellEnd"/>
+      <w:r>
+        <w:t>: "a regra de fretamento inviabiliza o pequeno empresário").</w:t>
       </w:r>
     </w:p>
     <w:p>
@@ -3995,7 +4050,23 @@
         <w:pStyle w:val="Commarcadores"/>
       </w:pPr>
       <w:r>
-        <w:t>Se o usuário fizer uma reclamação (ex: "o ônibus atrasou") e uma pergunta (ex: "quais os horários oficiais?"), a ouvidoria deve ser categorizada duplamente ou priorizar o fato principal (o atraso), mantendo o registro da informação prestada.</w:t>
+        <w:t>Se o usuário fizer uma reclamação (</w:t>
+      </w:r>
+      <w:proofErr w:type="spellStart"/>
+      <w:r>
+        <w:t>ex</w:t>
+      </w:r>
+      <w:proofErr w:type="spellEnd"/>
+      <w:r>
+        <w:t>: "o ônibus atrasou") e uma pergunta (</w:t>
+      </w:r>
+      <w:proofErr w:type="spellStart"/>
+      <w:r>
+        <w:t>ex</w:t>
+      </w:r>
+      <w:proofErr w:type="spellEnd"/>
+      <w:r>
+        <w:t>: "quais os horários oficiais?"), a ouvidoria deve ser categorizada duplamente ou priorizar o fato principal (o atraso), mantendo o registro da informação prestada.</w:t>
       </w:r>
     </w:p>
     <w:p>
@@ -4045,6 +4116,172 @@
       </w:pPr>
       <w:r>
         <w:t>"Onde encontro a tabela de multas atualizada da ARTESP?"</w:t>
+      </w:r>
+    </w:p>
+    <w:p>
+      <w:pPr>
+        <w:pStyle w:val="Ttulo1"/>
+      </w:pPr>
+      <w:r>
+        <w:t>26</w:t>
+      </w:r>
+      <w:r>
+        <w:t xml:space="preserve">. </w:t>
+      </w:r>
+      <w:r>
+        <w:t>SUGESTÃO DE ATENDIMENTO REGULAR</w:t>
+      </w:r>
+    </w:p>
+    <w:p>
+      <w:r>
+        <w:t>Definição:</w:t>
+      </w:r>
+      <w:r>
+        <w:br/>
+      </w:r>
+      <w:r>
+        <w:t>Criação de Novas Linhas: Pedidos para estabelecer conexão direta entre cidades que hoje não possuem nenhuma opção de transporte intermunicipal entre si.</w:t>
+      </w:r>
+    </w:p>
+    <w:p>
+      <w:r>
+        <w:t>Quando utilizar:</w:t>
+      </w:r>
+    </w:p>
+    <w:p>
+      <w:pPr>
+        <w:pStyle w:val="Commarcadores"/>
+      </w:pPr>
+      <w:r>
+        <w:t>Prolongamento de Linhas: Sugestões para estender o ponto final ou o trajeto de uma linha já existente para que ela alcance uma nova localidade, bairro periférico, distrito industrial ou campus universitário.</w:t>
+      </w:r>
+    </w:p>
+    <w:p>
+      <w:pPr>
+        <w:pStyle w:val="Commarcadores"/>
+      </w:pPr>
+      <w:r>
+        <w:t>Atendimento a Novos Polos: Demandas geradas por novos empreendimentos (</w:t>
+      </w:r>
+      <w:proofErr w:type="spellStart"/>
+      <w:r>
+        <w:t>ex</w:t>
+      </w:r>
+      <w:proofErr w:type="spellEnd"/>
+      <w:r>
+        <w:t>: novos shoppings, hospitais regionais ou complexos habitacionais) que necessitem de oferta de transporte oficial.</w:t>
+      </w:r>
+    </w:p>
+    <w:p>
+      <w:pPr>
+        <w:pStyle w:val="Commarcadores"/>
+      </w:pPr>
+      <w:r>
+        <w:lastRenderedPageBreak/>
+        <w:t>Atendimento de novas regiões ou outras áreas com alteração de itinerário: Solicitações para alteração de itinerário para atender outras áreas.</w:t>
+      </w:r>
+    </w:p>
+    <w:p>
+      <w:pPr>
+        <w:pStyle w:val="Commarcadores"/>
+      </w:pPr>
+      <w:r>
+        <w:t xml:space="preserve">Vácuos Operacionais: Situações </w:t>
+      </w:r>
+      <w:r>
+        <w:t>em que</w:t>
+      </w:r>
+      <w:r>
+        <w:t xml:space="preserve"> a ausência de atendimento oficial força o usuário a utilizar transporte irregular para chegar ao seu destino.</w:t>
+      </w:r>
+    </w:p>
+    <w:p>
+      <w:pPr>
+        <w:pStyle w:val="Commarcadores"/>
+        <w:numPr>
+          <w:ilvl w:val="0"/>
+          <w:numId w:val="0"/>
+        </w:numPr>
+      </w:pPr>
+    </w:p>
+    <w:p>
+      <w:pPr>
+        <w:pStyle w:val="Commarcadores"/>
+        <w:numPr>
+          <w:ilvl w:val="0"/>
+          <w:numId w:val="0"/>
+        </w:numPr>
+      </w:pPr>
+      <w:r>
+        <w:t>O que não inclui</w:t>
+      </w:r>
+      <w:r>
+        <w:t>:</w:t>
+      </w:r>
+    </w:p>
+    <w:p>
+      <w:pPr>
+        <w:pStyle w:val="Commarcadores"/>
+      </w:pPr>
+      <w:r>
+        <w:t>Aumento de Frequência: Pedidos de mais horários em uma rota que já atende os locais solicitados (Direcionar para: HORÁRIO / TABELA DE HORÁRIOS).</w:t>
+      </w:r>
+    </w:p>
+    <w:p>
+      <w:r>
+        <w:t>Exemplos:</w:t>
+      </w:r>
+    </w:p>
+    <w:p>
+      <w:pPr>
+        <w:pStyle w:val="Commarcadores"/>
+      </w:pPr>
+      <w:r>
+        <w:t>"Gostaria que a linha que termina na cidade A fosse prolongada até o bairro industrial que abriu na divisa."</w:t>
+      </w:r>
+    </w:p>
+    <w:p>
+      <w:pPr>
+        <w:pStyle w:val="Commarcadores"/>
+      </w:pPr>
+      <w:r>
+        <w:t>"Não existe ônibus direto de Campinas para esta cidadezinha do interior; seria necessário criar esse atendimento."</w:t>
+      </w:r>
+    </w:p>
+    <w:p>
+      <w:pPr>
+        <w:pStyle w:val="Commarcadores"/>
+      </w:pPr>
+      <w:r>
+        <w:t>"A faculdade nova fica a 5km de onde o ônibus para. Seria possível estender o atendimento até o portão principal?"</w:t>
+      </w:r>
+    </w:p>
+    <w:p>
+      <w:pPr>
+        <w:pStyle w:val="Ttulo1"/>
+      </w:pPr>
+      <w:r>
+        <w:t>2</w:t>
+      </w:r>
+      <w:r>
+        <w:t>7</w:t>
+      </w:r>
+      <w:r>
+        <w:t xml:space="preserve">. </w:t>
+      </w:r>
+      <w:r>
+        <w:t>OUTRAS SUGESTÕES</w:t>
+      </w:r>
+    </w:p>
+    <w:p>
+      <w:r>
+        <w:t>Definição:</w:t>
+      </w:r>
+      <w:r>
+        <w:br/>
+      </w:r>
+      <w:r>
+        <w:t>Engloba propostas de melhorias que não envolvam o trajeto dos ônibus, mas sim o atendimento, sistemas ou processos da ARTESP e das empresas.</w:t>
       </w:r>
     </w:p>
     <w:p>
@@ -4056,174 +4293,6 @@
         </w:numPr>
         <w:ind w:left="360" w:hanging="360"/>
       </w:pPr>
-    </w:p>
-    <w:p>
-      <w:pPr>
-        <w:pStyle w:val="Ttulo1"/>
-      </w:pPr>
-      <w:r>
-        <w:t>26</w:t>
-      </w:r>
-      <w:r>
-        <w:t xml:space="preserve">. </w:t>
-      </w:r>
-      <w:r>
-        <w:t>SUGESTÃO DE ATENDIMENTO REGULAR</w:t>
-      </w:r>
-    </w:p>
-    <w:p>
-      <w:r>
-        <w:t>Definição:</w:t>
-      </w:r>
-      <w:r>
-        <w:br/>
-      </w:r>
-      <w:r>
-        <w:t>Criação de Novas Linhas: Pedidos para estabelecer conexão direta entre cidades que hoje não possuem nenhuma opção de transporte intermunicipal entre si.</w:t>
-      </w:r>
-    </w:p>
-    <w:p>
-      <w:r>
-        <w:t>Quando utilizar:</w:t>
-      </w:r>
-    </w:p>
-    <w:p>
-      <w:pPr>
-        <w:pStyle w:val="Commarcadores"/>
-      </w:pPr>
-      <w:r>
-        <w:t>Prolongamento de Linhas: Sugestões para estender o ponto final ou o trajeto de uma linha já existente para que ela alcance uma nova localidade, bairro periférico, distrito industrial ou campus universitário.</w:t>
-      </w:r>
-    </w:p>
-    <w:p>
-      <w:pPr>
-        <w:pStyle w:val="Commarcadores"/>
-      </w:pPr>
-      <w:r>
-        <w:t>Atendimento a Novos Polos: Demandas geradas por novos empreendimentos (ex: novos shoppings, hospitais regionais ou complexos habitacionais) que necessitem de oferta de transporte oficial.</w:t>
-      </w:r>
-    </w:p>
-    <w:p>
-      <w:pPr>
-        <w:pStyle w:val="Commarcadores"/>
-      </w:pPr>
-      <w:r>
-        <w:lastRenderedPageBreak/>
-        <w:t>Atendimento de novas regiões ou outras áreas com alteração de itinerário: Solicitações para alteração de itinerário para atender outras áreas.</w:t>
-      </w:r>
-    </w:p>
-    <w:p>
-      <w:pPr>
-        <w:pStyle w:val="Commarcadores"/>
-      </w:pPr>
-      <w:r>
-        <w:t xml:space="preserve">Vácuos Operacionais: Situações </w:t>
-      </w:r>
-      <w:r>
-        <w:t>em que</w:t>
-      </w:r>
-      <w:r>
-        <w:t xml:space="preserve"> a ausência de atendimento oficial força o usuário a utilizar transporte irregular para chegar ao seu destino.</w:t>
-      </w:r>
-    </w:p>
-    <w:p>
-      <w:pPr>
-        <w:pStyle w:val="Commarcadores"/>
-        <w:numPr>
-          <w:ilvl w:val="0"/>
-          <w:numId w:val="0"/>
-        </w:numPr>
-      </w:pPr>
-    </w:p>
-    <w:p>
-      <w:pPr>
-        <w:pStyle w:val="Commarcadores"/>
-        <w:numPr>
-          <w:ilvl w:val="0"/>
-          <w:numId w:val="0"/>
-        </w:numPr>
-      </w:pPr>
-      <w:r>
-        <w:t>O que não inclui</w:t>
-      </w:r>
-      <w:r>
-        <w:t>:</w:t>
-      </w:r>
-    </w:p>
-    <w:p>
-      <w:pPr>
-        <w:pStyle w:val="Commarcadores"/>
-      </w:pPr>
-      <w:r>
-        <w:t>Aumento de Frequência: Pedidos de mais horários em uma rota que já atende os locais solicitados (Direcionar para: HORÁRIO / TABELA DE HORÁRIOS).</w:t>
-      </w:r>
-    </w:p>
-    <w:p>
-      <w:r>
-        <w:t>Exemplos:</w:t>
-      </w:r>
-    </w:p>
-    <w:p>
-      <w:pPr>
-        <w:pStyle w:val="Commarcadores"/>
-      </w:pPr>
-      <w:r>
-        <w:t>"Gostaria que a linha que termina na cidade A fosse prolongada até o bairro industrial que abriu na divisa."</w:t>
-      </w:r>
-    </w:p>
-    <w:p>
-      <w:pPr>
-        <w:pStyle w:val="Commarcadores"/>
-      </w:pPr>
-      <w:r>
-        <w:t>"Não existe ônibus direto de Campinas para esta cidadezinha do interior; seria necessário criar esse atendimento."</w:t>
-      </w:r>
-    </w:p>
-    <w:p>
-      <w:pPr>
-        <w:pStyle w:val="Commarcadores"/>
-      </w:pPr>
-      <w:r>
-        <w:t>"A faculdade nova fica a 5km de onde o ônibus para. Seria possível estender o atendimento até o portão principal?"</w:t>
-      </w:r>
-    </w:p>
-    <w:p>
-      <w:pPr>
-        <w:pStyle w:val="Ttulo1"/>
-      </w:pPr>
-      <w:r>
-        <w:t>2</w:t>
-      </w:r>
-      <w:r>
-        <w:t>7</w:t>
-      </w:r>
-      <w:r>
-        <w:t xml:space="preserve">. </w:t>
-      </w:r>
-      <w:r>
-        <w:t>OUTRAS SUGESTÕES</w:t>
-      </w:r>
-    </w:p>
-    <w:p>
-      <w:r>
-        <w:t>Definição:</w:t>
-      </w:r>
-      <w:r>
-        <w:br/>
-      </w:r>
-      <w:r>
-        <w:t>Engloba propostas de melhorias que não envolvam o trajeto dos ônibus, mas sim o atendimento, sistemas ou processos da ARTESP e das empresas.</w:t>
-      </w:r>
-    </w:p>
-    <w:p>
-      <w:pPr>
-        <w:pStyle w:val="Commarcadores"/>
-        <w:numPr>
-          <w:ilvl w:val="0"/>
-          <w:numId w:val="0"/>
-        </w:numPr>
-        <w:ind w:left="360" w:hanging="360"/>
-      </w:pPr>
       <w:r>
         <w:t>Quando utilizar:</w:t>
       </w:r>
@@ -4274,7 +4343,15 @@
         </w:rPr>
       </w:pPr>
       <w:r>
-        <w:t>"Deveria ter um sistema de QR Code no ponto para sabermos que horas o ônibus passa."</w:t>
+        <w:t xml:space="preserve">"Deveria ter um sistema de QR </w:t>
+      </w:r>
+      <w:proofErr w:type="spellStart"/>
+      <w:r>
+        <w:t>Code</w:t>
+      </w:r>
+      <w:proofErr w:type="spellEnd"/>
+      <w:r>
+        <w:t xml:space="preserve"> no ponto para sabermos que horas o ônibus passa."</w:t>
       </w:r>
     </w:p>
     <w:p>

</xml_diff>